<commit_message>
fix: génération documents — bailleur, civilité EI, forme juridique CEPICI
- Bailleur : repli sur la table leases quand le body ne l'envoie pas
  (corrige les bails vides générés depuis le tableau de bord)
- Bail EI : civilité du preneur dynamique (Monsieur/Madame/Mademoiselle)
- Liste gérants SARLU : type de pièce dynamique ({type_identite} au lieu
  de CNI en dur dans le template)
- Liste gérants Pluri : lieu de délivrance dynamique (au lieu de
  'République de Côte d'Ivoire' en dur)
- Exigence CEPICI : jamais 'SARL' seul — 'SARL unipersonnelle' /
  'SARL pluripersonnelle' sur tous les documents (dénomination,
  statuts, DSV, formulaire CEPICI)

Co-Authored-By: Claude Opus 4.8 <noreply@anthropic.com>
</commit_message>
<xml_diff>
--- a/backend/templates/dsv_sarlu_template.docx
+++ b/backend/templates/dsv_sarlu_template.docx
@@ -369,7 +369,7 @@
           <w:sz w:val="24"/>
           <w:szCs w:val="24"/>
         </w:rPr>
-        <w:t xml:space="preserve">Ont établi, les statuts de la Société à Responsabilité Limitée</w:t>
+        <w:t xml:space="preserve">Ont établi, les statuts de la Société à Responsabilité Limitée unipersonnelle</w:t>
       </w:r>
       <w:r>
         <w:rPr>
@@ -418,7 +418,7 @@
           <w:sz w:val="24"/>
           <w:szCs w:val="24"/>
         </w:rPr>
-        <w:t xml:space="preserve">La société constituée est une société à Responsabilité Limitée régie par les dispositions de l'Acte uniforme révisé de l'OHADA du 30 janvier 2014 relatif au droit des Sociétés commerciales et du Groupement d'intérêt économique (GIE), ainsi que par toutes autres dispositions légales ou réglementaires applicables et ses présents statuts.</w:t>
+        <w:t xml:space="preserve">La société constituée est une société à Responsabilité Limitée unipersonnelle régie par les dispositions de l'Acte uniforme révisé de l'OHADA du 30 janvier 2014 relatif au droit des Sociétés commerciales et du Groupement d'intérêt économique (GIE), ainsi que par toutes autres dispositions légales ou réglementaires applicables et ses présents statuts.</w:t>
       </w:r>
     </w:p>
     <w:p>

</xml_diff>